<commit_message>
Add Open Graph and Twitter card metadata with preview image
</commit_message>
<xml_diff>
--- a/src/assets/Lewis_Robinson_CV_web.docx
+++ b/src/assets/Lewis_Robinson_CV_web.docx
@@ -129,7 +129,7 @@
                 <w:sz w:val="18"/>
                 <w:szCs w:val="18"/>
               </w:rPr>
-              <w:t xml:space="preserve"/>
+              <w:t>portfolio.lewisrobinson-cs.workers.dev</w:t>
             </w:r>
           </w:p>
         </w:tc>
@@ -212,7 +212,7 @@
         <w:pBdr>
           <w:bottom w:val="single" w:sz="6" w:space="2" w:color="1A1A1A"/>
         </w:pBdr>
-        <w:spacing w:before="220" w:after="90"/>
+        <w:spacing w:before="150" w:after="70"/>
       </w:pPr>
       <w:r>
         <w:rPr>
@@ -381,7 +381,7 @@
         <w:pBdr>
           <w:bottom w:val="single" w:sz="6" w:space="2" w:color="1A1A1A"/>
         </w:pBdr>
-        <w:spacing w:before="220" w:after="90"/>
+        <w:spacing w:before="150" w:after="70"/>
       </w:pPr>
       <w:r>
         <w:rPr>
@@ -621,7 +621,7 @@
         <w:pBdr>
           <w:bottom w:val="single" w:sz="6" w:space="2" w:color="1A1A1A"/>
         </w:pBdr>
-        <w:spacing w:before="220" w:after="90"/>
+        <w:spacing w:before="150" w:after="70"/>
       </w:pPr>
       <w:r>
         <w:rPr>
@@ -1088,7 +1088,7 @@
         <w:pBdr>
           <w:bottom w:val="single" w:sz="6" w:space="2" w:color="1A1A1A"/>
         </w:pBdr>
-        <w:spacing w:before="220" w:after="90"/>
+        <w:spacing w:before="150" w:after="70"/>
       </w:pPr>
       <w:r>
         <w:rPr>
@@ -1276,7 +1276,7 @@
         <w:pBdr>
           <w:bottom w:val="single" w:sz="6" w:space="2" w:color="1A1A1A"/>
         </w:pBdr>
-        <w:spacing w:before="220" w:after="90"/>
+        <w:spacing w:before="150" w:after="70"/>
       </w:pPr>
       <w:r>
         <w:rPr>

</xml_diff>

<commit_message>
Update portfolio for Laravel/Seedle stack and refresh download CV
</commit_message>
<xml_diff>
--- a/src/assets/Lewis_Robinson_CV_web.docx
+++ b/src/assets/Lewis_Robinson_CV_web.docx
@@ -1,5 +1,51 @@
 
-<file path=word/document.xml><?xml version="1.0" encoding="utf-8"?>
+<file path=docProps\app.xml><?xml version="1.0" encoding="utf-8"?>
+<Properties xmlns="http://schemas.openxmlformats.org/officeDocument/2006/extended-properties" xmlns:vt="http://schemas.openxmlformats.org/officeDocument/2006/docPropsVTypes">
+  <Template>Normal.dotm</Template>
+  <TotalTime>40</TotalTime>
+  <Pages>1</Pages>
+  <Words>553</Words>
+  <Characters>3153</Characters>
+  <Application>Microsoft Office Word</Application>
+  <DocSecurity>0</DocSecurity>
+  <Lines>26</Lines>
+  <Paragraphs>7</Paragraphs>
+  <ScaleCrop>false</ScaleCrop>
+  <HeadingPairs>
+    <vt:vector size="2" baseType="variant">
+      <vt:variant>
+        <vt:lpstr>Title</vt:lpstr>
+      </vt:variant>
+      <vt:variant>
+        <vt:i4>1</vt:i4>
+      </vt:variant>
+    </vt:vector>
+  </HeadingPairs>
+  <TitlesOfParts>
+    <vt:vector size="1" baseType="lpstr">
+      <vt:lpstr/>
+    </vt:vector>
+  </TitlesOfParts>
+  <Company/>
+  <LinksUpToDate>false</LinksUpToDate>
+  <CharactersWithSpaces>3699</CharactersWithSpaces>
+  <SharedDoc>false</SharedDoc>
+  <HyperlinksChanged>false</HyperlinksChanged>
+  <AppVersion>16.0000</AppVersion>
+</Properties>
+</file>
+
+<file path=docProps\core.xml><?xml version="1.0" encoding="utf-8"?>
+<cp:coreProperties xmlns:cp="http://schemas.openxmlformats.org/package/2006/metadata/core-properties" xmlns:dc="http://purl.org/dc/elements/1.1/" xmlns:dcterms="http://purl.org/dc/terms/" xmlns:dcmitype="http://purl.org/dc/dcmitype/" xmlns:xsi="http://www.w3.org/2001/XMLSchema-instance">
+  <dc:creator>Un-named</dc:creator>
+  <cp:lastModifiedBy>lewis Robinson</cp:lastModifiedBy>
+  <cp:revision>9</cp:revision>
+  <dcterms:created xsi:type="dcterms:W3CDTF">2026-09-08T18:29:00Z</dcterms:created>
+  <dcterms:modified xsi:type="dcterms:W3CDTF">2026-09-21T16:40:00Z</dcterms:modified>
+</cp:coreProperties>
+</file>
+
+<file path=word\document.xml><?xml version="1.0" encoding="utf-8"?>
 <w:document xmlns:wpc="http://schemas.microsoft.com/office/word/2010/wordprocessingCanvas" xmlns:cx="http://schemas.microsoft.com/office/drawing/2014/chartex" xmlns:cx1="http://schemas.microsoft.com/office/drawing/2015/9/8/chartex" xmlns:cx2="http://schemas.microsoft.com/office/drawing/2015/10/21/chartex" xmlns:cx3="http://schemas.microsoft.com/office/drawing/2016/5/9/chartex" xmlns:cx4="http://schemas.microsoft.com/office/drawing/2016/5/10/chartex" xmlns:cx5="http://schemas.microsoft.com/office/drawing/2016/5/11/chartex" xmlns:cx6="http://schemas.microsoft.com/office/drawing/2016/5/12/chartex" xmlns:cx7="http://schemas.microsoft.com/office/drawing/2016/5/13/chartex" xmlns:cx8="http://schemas.microsoft.com/office/drawing/2016/5/14/chartex" xmlns:mc="http://schemas.openxmlformats.org/markup-compatibility/2006" xmlns:aink="http://schemas.microsoft.com/office/drawing/2016/ink" xmlns:am3d="http://schemas.microsoft.com/office/drawing/2017/model3d" xmlns:o="urn:schemas-microsoft-com:office:office" xmlns:oel="http://schemas.microsoft.com/office/2019/extlst" xmlns:r="http://schemas.openxmlformats.org/officeDocument/2006/relationships" xmlns:m="http://schemas.openxmlformats.org/officeDocument/2006/math" xmlns:v="urn:schemas-microsoft-com:vml" xmlns:wp14="http://schemas.microsoft.com/office/word/2010/wordprocessingDrawing" xmlns:wp="http://schemas.openxmlformats.org/drawingml/2006/wordprocessingDrawing" xmlns:w10="urn:schemas-microsoft-com:office:word" xmlns:w="http://schemas.openxmlformats.org/wordprocessingml/2006/main" xmlns:w14="http://schemas.microsoft.com/office/word/2010/wordml" xmlns:w15="http://schemas.microsoft.com/office/word/2012/wordml" xmlns:w16cex="http://schemas.microsoft.com/office/word/2018/wordml/cex" xmlns:w16cid="http://schemas.microsoft.com/office/word/2016/wordml/cid" xmlns:w16="http://schemas.microsoft.com/office/word/2018/wordml" xmlns:w16du="http://schemas.microsoft.com/office/word/2023/wordml/word16du" xmlns:w16sdtdh="http://schemas.microsoft.com/office/word/2020/wordml/sdtdatahash" xmlns:w16sdtfl="http://schemas.microsoft.com/office/word/2024/wordml/sdtformatlock" xmlns:w16se="http://schemas.microsoft.com/office/word/2015/wordml/symex" xmlns:wpg="http://schemas.microsoft.com/office/word/2010/wordprocessingGroup" xmlns:wpi="http://schemas.microsoft.com/office/word/2010/wordprocessingInk" xmlns:wne="http://schemas.microsoft.com/office/word/2006/wordml" xmlns:wps="http://schemas.microsoft.com/office/word/2010/wordprocessingShape" mc:Ignorable="w14 w15 w16se w16cid w16 w16cex w16sdtdh w16sdtfl w16du wp14">
   <w:body>
     <w:tbl>
@@ -204,7 +250,7 @@
           <w:sz w:val="19"/>
           <w:szCs w:val="19"/>
         </w:rPr>
-        <w:t>MSc Computer Science graduate from Newcastle University with a strong foundation in backend software development, building RESTful APIs, relational data models, and service-layer architecture in Java and Spring Boot. Experienced across the full stack, including React frontends and PostgreSQL/MySQL databases, with a track record of shipping projects end-to-end, including a live site delivered for a paying client.</w:t>
+        <w:t>MSc Computer Science graduate from Newcastle University with backend experience across Laravel/PHP and Java/Spring Boot: RESTful APIs, relational data models, and service-layer architecture. Experienced across the full stack, including React frontends, MySQL/PostgreSQL/Elasticsearch, and real-time and payment integrations, with a track record of shipping projects end-to-end, including a live marketplace handling real transactions.</w:t>
       </w:r>
     </w:p>
     <w:p>
@@ -772,7 +818,7 @@
           <w:sz w:val="19"/>
           <w:szCs w:val="19"/>
         </w:rPr>
-        <w:t>Built a RESTful API and service layer in Spring Boot handling listing management, messaging, and user relationships, backed by PostgreSQL.</w:t>
+        <w:t>Built a Laravel / PHP REST API with Sanctum auth, real-time buyer-seller messaging over Reverb (WebSockets), and Stripe Connect for split marketplace payments.</w:t>
       </w:r>
     </w:p>
     <w:p>
@@ -790,7 +836,7 @@
           <w:sz w:val="19"/>
           <w:szCs w:val="19"/>
         </w:rPr>
-        <w:t>Implemented JWT-based authentication and account/session management.</w:t>
+        <w:t>Elasticsearch-backed listing search with custom analyzers for prefixes, slang and model numbers, roughly 3x faster than the SQL path it replaced, with an automatic fallback when the cluster is unreachable.</w:t>
       </w:r>
     </w:p>
     <w:p>
@@ -808,7 +854,7 @@
           <w:sz w:val="19"/>
           <w:szCs w:val="19"/>
         </w:rPr>
-        <w:t>Built a React frontend consuming the API, deployed to AWS (EC2 + PostgreSQL via Neon).</w:t>
+        <w:t>React 19 / TypeScript frontend; deployed via Docker Compose to a VPS behind Cloudflare, with CI running PHPUnit and Pint.</w:t>
       </w:r>
     </w:p>
     <w:tbl>
@@ -852,7 +898,7 @@
                 <w:sz w:val="21"/>
                 <w:szCs w:val="21"/>
               </w:rPr>
-              <w:t>WhistleStop Coffee Hut App</w:t>
+              <w:t>Seedle</w:t>
             </w:r>
             <w:r>
               <w:rPr>
@@ -860,7 +906,7 @@
                 <w:sz w:val="19"/>
                 <w:szCs w:val="19"/>
               </w:rPr>
-              <w:t xml:space="preserve"> Team Project (Backend Developer)</w:t>
+              <w:t xml:space="preserve"> Gardening Swap &amp; Planning Platform (Solo Project)</w:t>
             </w:r>
           </w:p>
         </w:tc>
@@ -884,7 +930,7 @@
                 <w:b/>
                 <w:bCs/>
               </w:rPr>
-              <w:t>Feb 2026 – May 2026</w:t>
+              <w:t>Sept 2026</w:t>
             </w:r>
           </w:p>
         </w:tc>
@@ -903,7 +949,7 @@
           <w:sz w:val="19"/>
           <w:szCs w:val="19"/>
         </w:rPr>
-        <w:t>North-East · Team of 5, Agile</w:t>
+        <w:t>North-East · Solo project · github.com/lewisr23/Seedle</w:t>
       </w:r>
     </w:p>
     <w:p>
@@ -921,7 +967,7 @@
           <w:sz w:val="19"/>
           <w:szCs w:val="19"/>
         </w:rPr>
-        <w:t>Owned backend development within a 5-person Agile team, building the authentication and customer management system for a mobile-optimised ordering platform using Java, Spring Boot, and MySQL.</w:t>
+        <w:t>Built a Laravel 13 / PHP 8.4 REST API with Sanctum auth and service classes for search, checkout and garden logic.</w:t>
       </w:r>
     </w:p>
     <w:p>
@@ -939,7 +985,7 @@
           <w:sz w:val="19"/>
           <w:szCs w:val="19"/>
         </w:rPr>
-        <w:t>Implemented JWT-based user registration, login, and session handling.</w:t>
+        <w:t>Added Elasticsearch-backed faceted search with a plain-MySQL fallback, exercised directly by the test suite.</w:t>
       </w:r>
     </w:p>
     <w:p>
@@ -957,7 +1003,7 @@
           <w:sz w:val="19"/>
           <w:szCs w:val="19"/>
         </w:rPr>
-        <w:t>Collaborated using Git across the team, integrating backend endpoints with a UI prototyped in Figma.</w:t>
+        <w:t>Split checkout into a row-locked DB transaction and an async pipeline of Redis-queued jobs; 129 PHPUnit tests, Docker Compose across 8 services, GitHub Actions CI.</w:t>
       </w:r>
     </w:p>
     <w:tbl>
@@ -1128,7 +1174,7 @@
           <w:sz w:val="19"/>
           <w:szCs w:val="19"/>
         </w:rPr>
-        <w:t>Java, Spring Boot, Spring Security, JPA/Hibernate, RESTful API design, service-layer architecture</w:t>
+        <w:t>Laravel, Spring Boot, Spring Security, Java, JPA/Hibernate, RESTful API design, service-layer architecture</w:t>
       </w:r>
     </w:p>
     <w:p>
@@ -1156,7 +1202,7 @@
           <w:sz w:val="19"/>
           <w:szCs w:val="19"/>
         </w:rPr>
-        <w:t>PostgreSQL, MySQL, relational schema design</w:t>
+        <w:t>MySQL, PostgreSQL, Elasticsearch, Redis, relational schema design</w:t>
       </w:r>
     </w:p>
     <w:p>
@@ -1184,7 +1230,7 @@
           <w:sz w:val="19"/>
           <w:szCs w:val="19"/>
         </w:rPr>
-        <w:t>React, JavaScript, HTML/CSS</w:t>
+        <w:t>React, JavaScript, HTML/CSS, SCSS</w:t>
       </w:r>
     </w:p>
     <w:p>
@@ -1212,7 +1258,7 @@
           <w:sz w:val="19"/>
           <w:szCs w:val="19"/>
         </w:rPr>
-        <w:t>Java, Python, JavaScript, SQL, HTML/CSS</w:t>
+        <w:t>PHP, Java, Python, JavaScript, SQL, HTML/CSS</w:t>
       </w:r>
     </w:p>
     <w:p>
@@ -1240,7 +1286,7 @@
           <w:sz w:val="19"/>
           <w:szCs w:val="19"/>
         </w:rPr>
-        <w:t>Git, Maven, Vite, pdf.js, Google Cloud Platform (GCP), AWS</w:t>
+        <w:t>Docker, Composer, Git, GitHub Actions (CI), PHPUnit, Maven, Vite, pdf.js, Google Cloud Platform (GCP), AWS</w:t>
       </w:r>
     </w:p>
     <w:p>
@@ -1268,7 +1314,7 @@
           <w:sz w:val="19"/>
           <w:szCs w:val="19"/>
         </w:rPr>
-        <w:t>OOP, MVC, Agile, Authentication &amp; Session Management, Concurrency</w:t>
+        <w:t>OOP, MVC, Agile, Authentication &amp; Session Management, Concurrency, Distributed Systems</w:t>
       </w:r>
     </w:p>
     <w:p>
@@ -1338,7 +1384,45 @@
 </w:document>
 </file>
 
-<file path=word/numbering.xml><?xml version="1.0" encoding="utf-8"?>
+<file path=word\fontTable.xml><?xml version="1.0" encoding="utf-8"?>
+<w:fonts xmlns:mc="http://schemas.openxmlformats.org/markup-compatibility/2006" xmlns:r="http://schemas.openxmlformats.org/officeDocument/2006/relationships" xmlns:w="http://schemas.openxmlformats.org/wordprocessingml/2006/main" xmlns:w14="http://schemas.microsoft.com/office/word/2010/wordml" xmlns:w15="http://schemas.microsoft.com/office/word/2012/wordml" xmlns:w16cex="http://schemas.microsoft.com/office/word/2018/wordml/cex" xmlns:w16cid="http://schemas.microsoft.com/office/word/2016/wordml/cid" xmlns:w16="http://schemas.microsoft.com/office/word/2018/wordml" xmlns:w16du="http://schemas.microsoft.com/office/word/2023/wordml/word16du" xmlns:w16sdtdh="http://schemas.microsoft.com/office/word/2020/wordml/sdtdatahash" xmlns:w16sdtfl="http://schemas.microsoft.com/office/word/2024/wordml/sdtformatlock" xmlns:w16se="http://schemas.microsoft.com/office/word/2015/wordml/symex" mc:Ignorable="w14 w15 w16se w16cid w16 w16cex w16sdtdh w16sdtfl w16du">
+  <w:font w:name="Times New Roman">
+    <w:panose1 w:val="02020603050405020304"/>
+    <w:charset w:val="00"/>
+    <w:family w:val="roman"/>
+    <w:pitch w:val="variable"/>
+    <w:sig w:usb0="E0002EFF" w:usb1="C000785B" w:usb2="00000009" w:usb3="00000000" w:csb0="000001FF" w:csb1="00000000"/>
+  </w:font>
+  <w:font w:name="Calibri">
+    <w:panose1 w:val="020F0502020204030204"/>
+    <w:charset w:val="00"/>
+    <w:family w:val="swiss"/>
+    <w:pitch w:val="variable"/>
+    <w:sig w:usb0="E4002EFF" w:usb1="C200247B" w:usb2="00000009" w:usb3="00000000" w:csb0="000001FF" w:csb1="00000000"/>
+  </w:font>
+  <w:font w:name="Cambria">
+    <w:panose1 w:val="02040503050406030204"/>
+    <w:charset w:val="00"/>
+    <w:family w:val="roman"/>
+    <w:pitch w:val="variable"/>
+    <w:sig w:usb0="E00006FF" w:usb1="420024FF" w:usb2="02000000" w:usb3="00000000" w:csb0="0000019F" w:csb1="00000000"/>
+  </w:font>
+  <w:font w:name="Aptos Display">
+    <w:charset w:val="00"/>
+    <w:family w:val="swiss"/>
+    <w:pitch w:val="variable"/>
+    <w:sig w:usb0="20000287" w:usb1="00000003" w:usb2="00000000" w:usb3="00000000" w:csb0="0000019F" w:csb1="00000000"/>
+  </w:font>
+  <w:font w:name="Aptos">
+    <w:charset w:val="00"/>
+    <w:family w:val="swiss"/>
+    <w:pitch w:val="variable"/>
+    <w:sig w:usb0="20000287" w:usb1="00000003" w:usb2="00000000" w:usb3="00000000" w:csb0="0000019F" w:csb1="00000000"/>
+  </w:font>
+</w:fonts>
+</file>
+
+<file path=word\numbering.xml><?xml version="1.0" encoding="utf-8"?>
 <w:numbering xmlns:wpc="http://schemas.microsoft.com/office/word/2010/wordprocessingCanvas" xmlns:cx="http://schemas.microsoft.com/office/drawing/2014/chartex" xmlns:cx1="http://schemas.microsoft.com/office/drawing/2015/9/8/chartex" xmlns:cx2="http://schemas.microsoft.com/office/drawing/2015/10/21/chartex" xmlns:cx3="http://schemas.microsoft.com/office/drawing/2016/5/9/chartex" xmlns:cx4="http://schemas.microsoft.com/office/drawing/2016/5/10/chartex" xmlns:cx5="http://schemas.microsoft.com/office/drawing/2016/5/11/chartex" xmlns:cx6="http://schemas.microsoft.com/office/drawing/2016/5/12/chartex" xmlns:cx7="http://schemas.microsoft.com/office/drawing/2016/5/13/chartex" xmlns:cx8="http://schemas.microsoft.com/office/drawing/2016/5/14/chartex" xmlns:mc="http://schemas.openxmlformats.org/markup-compatibility/2006" xmlns:aink="http://schemas.microsoft.com/office/drawing/2016/ink" xmlns:am3d="http://schemas.microsoft.com/office/drawing/2017/model3d" xmlns:o="urn:schemas-microsoft-com:office:office" xmlns:oel="http://schemas.microsoft.com/office/2019/extlst" xmlns:r="http://schemas.openxmlformats.org/officeDocument/2006/relationships" xmlns:m="http://schemas.openxmlformats.org/officeDocument/2006/math" xmlns:v="urn:schemas-microsoft-com:vml" xmlns:wp14="http://schemas.microsoft.com/office/word/2010/wordprocessingDrawing" xmlns:wp="http://schemas.openxmlformats.org/drawingml/2006/wordprocessingDrawing" xmlns:w10="urn:schemas-microsoft-com:office:word" xmlns:w="http://schemas.openxmlformats.org/wordprocessingml/2006/main" xmlns:w14="http://schemas.microsoft.com/office/word/2010/wordml" xmlns:w15="http://schemas.microsoft.com/office/word/2012/wordml" xmlns:w16cex="http://schemas.microsoft.com/office/word/2018/wordml/cex" xmlns:w16cid="http://schemas.microsoft.com/office/word/2016/wordml/cid" xmlns:w16="http://schemas.microsoft.com/office/word/2018/wordml" xmlns:w16du="http://schemas.microsoft.com/office/word/2023/wordml/word16du" xmlns:w16sdtdh="http://schemas.microsoft.com/office/word/2020/wordml/sdtdatahash" xmlns:w16sdtfl="http://schemas.microsoft.com/office/word/2024/wordml/sdtformatlock" xmlns:w16se="http://schemas.microsoft.com/office/word/2015/wordml/symex" xmlns:wpg="http://schemas.microsoft.com/office/word/2010/wordprocessingGroup" xmlns:wpi="http://schemas.microsoft.com/office/word/2010/wordprocessingInk" xmlns:wne="http://schemas.microsoft.com/office/word/2006/wordml" xmlns:wps="http://schemas.microsoft.com/office/word/2010/wordprocessingShape" mc:Ignorable="w14 w15 w16se w16cid w16 w16cex w16sdtdh w16sdtfl w16du wp14">
   <w:abstractNum w:abstractNumId="0" w15:restartNumberingAfterBreak="0">
     <w:nsid w:val="264F667E"/>
@@ -1495,7 +1579,66 @@
 </w:numbering>
 </file>
 
-<file path=word/styles.xml><?xml version="1.0" encoding="utf-8"?>
+<file path=word\settings.xml><?xml version="1.0" encoding="utf-8"?>
+<w:settings xmlns:mc="http://schemas.openxmlformats.org/markup-compatibility/2006" xmlns:o="urn:schemas-microsoft-com:office:office" xmlns:r="http://schemas.openxmlformats.org/officeDocument/2006/relationships" xmlns:m="http://schemas.openxmlformats.org/officeDocument/2006/math" xmlns:v="urn:schemas-microsoft-com:vml" xmlns:w10="urn:schemas-microsoft-com:office:word" xmlns:w="http://schemas.openxmlformats.org/wordprocessingml/2006/main" xmlns:w14="http://schemas.microsoft.com/office/word/2010/wordml" xmlns:w15="http://schemas.microsoft.com/office/word/2012/wordml" xmlns:w16cex="http://schemas.microsoft.com/office/word/2018/wordml/cex" xmlns:w16cid="http://schemas.microsoft.com/office/word/2016/wordml/cid" xmlns:w16="http://schemas.microsoft.com/office/word/2018/wordml" xmlns:w16du="http://schemas.microsoft.com/office/word/2023/wordml/word16du" xmlns:w16sdtdh="http://schemas.microsoft.com/office/word/2020/wordml/sdtdatahash" xmlns:w16sdtfl="http://schemas.microsoft.com/office/word/2024/wordml/sdtformatlock" xmlns:w16se="http://schemas.microsoft.com/office/word/2015/wordml/symex" xmlns:sl="http://schemas.openxmlformats.org/schemaLibrary/2006/main" mc:Ignorable="w14 w15 w16se w16cid w16 w16cex w16sdtdh w16sdtfl w16du">
+  <w:zoom w:percent="100"/>
+  <w:displayBackgroundShape/>
+  <w:proofState w:spelling="clean" w:grammar="clean"/>
+  <w:defaultTabStop w:val="720"/>
+  <w:characterSpacingControl w:val="doNotCompress"/>
+  <w:compat>
+    <w:compatSetting w:name="compatibilityMode" w:uri="http://schemas.microsoft.com/office/word" w:val="15"/>
+    <w:compatSetting w:name="overrideTableStyleFontSizeAndJustification" w:uri="http://schemas.microsoft.com/office/word" w:val="1"/>
+    <w:compatSetting w:name="enableOpenTypeFeatures" w:uri="http://schemas.microsoft.com/office/word" w:val="1"/>
+    <w:compatSetting w:name="doNotFlipMirrorIndents" w:uri="http://schemas.microsoft.com/office/word" w:val="1"/>
+    <w:compatSetting w:name="differentiateMultirowTableHeaders" w:uri="http://schemas.microsoft.com/office/word" w:val="1"/>
+    <w:compatSetting w:name="useWord2013TrackBottomHyphenation" w:uri="http://schemas.microsoft.com/office/word" w:val="1"/>
+  </w:compat>
+  <w:rsids>
+    <w:rsidRoot w:val="00E5078D"/>
+    <w:rsid w:val="00084308"/>
+    <w:rsid w:val="00107094"/>
+    <w:rsid w:val="001813F1"/>
+    <w:rsid w:val="002E093F"/>
+    <w:rsid w:val="005C4C44"/>
+    <w:rsid w:val="007369F9"/>
+    <w:rsid w:val="0077218D"/>
+    <w:rsid w:val="00820362"/>
+    <w:rsid w:val="00D924BF"/>
+    <w:rsid w:val="00E5078D"/>
+    <w:rsid w:val="00FA3693"/>
+    <w:rsid w:val="00FB4031"/>
+    <w:rsid w:val="00FF37D4"/>
+  </w:rsids>
+  <m:mathPr>
+    <m:mathFont m:val="Cambria Math"/>
+    <m:brkBin m:val="before"/>
+    <m:brkBinSub m:val="--"/>
+    <m:smallFrac m:val="0"/>
+    <m:dispDef/>
+    <m:lMargin m:val="0"/>
+    <m:rMargin m:val="0"/>
+    <m:defJc m:val="centerGroup"/>
+    <m:wrapIndent m:val="1440"/>
+    <m:intLim m:val="subSup"/>
+    <m:naryLim m:val="undOvr"/>
+  </m:mathPr>
+  <w:themeFontLang w:val="en-GB"/>
+  <w:clrSchemeMapping w:bg1="light1" w:t1="dark1" w:bg2="light2" w:t2="dark2" w:accent1="accent1" w:accent2="accent2" w:accent3="accent3" w:accent4="accent4" w:accent5="accent5" w:accent6="accent6" w:hyperlink="hyperlink" w:followedHyperlink="followedHyperlink"/>
+  <w:shapeDefaults>
+    <o:shapedefaults v:ext="edit" spidmax="1026"/>
+    <o:shapelayout v:ext="edit">
+      <o:idmap v:ext="edit" data="1"/>
+    </o:shapelayout>
+  </w:shapeDefaults>
+  <w:decimalSymbol w:val="."/>
+  <w:listSeparator w:val=","/>
+  <w14:docId w14:val="562592AB"/>
+  <w15:docId w15:val="{C6A609E7-4FE7-431B-88AD-E63097161F41}"/>
+</w:settings>
+</file>
+
+<file path=word\styles.xml><?xml version="1.0" encoding="utf-8"?>
 <w:styles xmlns:mc="http://schemas.openxmlformats.org/markup-compatibility/2006" xmlns:r="http://schemas.openxmlformats.org/officeDocument/2006/relationships" xmlns:w="http://schemas.openxmlformats.org/wordprocessingml/2006/main" xmlns:w14="http://schemas.microsoft.com/office/word/2010/wordml" xmlns:w15="http://schemas.microsoft.com/office/word/2012/wordml" xmlns:w16cex="http://schemas.microsoft.com/office/word/2018/wordml/cex" xmlns:w16cid="http://schemas.microsoft.com/office/word/2016/wordml/cid" xmlns:w16="http://schemas.microsoft.com/office/word/2018/wordml" xmlns:w16du="http://schemas.microsoft.com/office/word/2023/wordml/word16du" xmlns:w16sdtdh="http://schemas.microsoft.com/office/word/2020/wordml/sdtdatahash" xmlns:w16sdtfl="http://schemas.microsoft.com/office/word/2024/wordml/sdtformatlock" xmlns:w16se="http://schemas.microsoft.com/office/word/2015/wordml/symex" mc:Ignorable="w14 w15 w16se w16cid w16 w16cex w16sdtdh w16sdtfl w16du">
   <w:docDefaults>
     <w:rPrDefault>
@@ -2086,7 +2229,7 @@
 </w:styles>
 </file>
 
-<file path=word/theme/theme1.xml><?xml version="1.0" encoding="utf-8"?>
+<file path=word\theme\theme1.xml><?xml version="1.0" encoding="utf-8"?>
 <a:theme xmlns:a="http://schemas.openxmlformats.org/drawingml/2006/main" name="Office Theme">
   <a:themeElements>
     <a:clrScheme name="Office">
@@ -2399,4 +2542,11 @@
     </a:ext>
   </a:extLst>
 </a:theme>
+</file>
+
+<file path=word\webSettings.xml><?xml version="1.0" encoding="utf-8"?>
+<w:webSettings xmlns:mc="http://schemas.openxmlformats.org/markup-compatibility/2006" xmlns:r="http://schemas.openxmlformats.org/officeDocument/2006/relationships" xmlns:w="http://schemas.openxmlformats.org/wordprocessingml/2006/main" xmlns:w14="http://schemas.microsoft.com/office/word/2010/wordml" xmlns:w15="http://schemas.microsoft.com/office/word/2012/wordml" xmlns:w16cex="http://schemas.microsoft.com/office/word/2018/wordml/cex" xmlns:w16cid="http://schemas.microsoft.com/office/word/2016/wordml/cid" xmlns:w16="http://schemas.microsoft.com/office/word/2018/wordml" xmlns:w16du="http://schemas.microsoft.com/office/word/2023/wordml/word16du" xmlns:w16sdtdh="http://schemas.microsoft.com/office/word/2020/wordml/sdtdatahash" xmlns:w16sdtfl="http://schemas.microsoft.com/office/word/2024/wordml/sdtformatlock" xmlns:w16se="http://schemas.microsoft.com/office/word/2015/wordml/symex" mc:Ignorable="w14 w15 w16se w16cid w16 w16cex w16sdtdh w16sdtfl w16du">
+  <w:relyOnVML/>
+  <w:allowPNG/>
+</w:webSettings>
 </file>
</xml_diff>

<commit_message>
switch to black and white
</commit_message>
<xml_diff>
--- a/src/assets/Lewis_Robinson_CV_web.docx
+++ b/src/assets/Lewis_Robinson_CV_web.docx
@@ -1,51 +1,5 @@
 
-<file path=docProps\app.xml><?xml version="1.0" encoding="utf-8"?>
-<Properties xmlns="http://schemas.openxmlformats.org/officeDocument/2006/extended-properties" xmlns:vt="http://schemas.openxmlformats.org/officeDocument/2006/docPropsVTypes">
-  <Template>Normal.dotm</Template>
-  <TotalTime>40</TotalTime>
-  <Pages>1</Pages>
-  <Words>553</Words>
-  <Characters>3153</Characters>
-  <Application>Microsoft Office Word</Application>
-  <DocSecurity>0</DocSecurity>
-  <Lines>26</Lines>
-  <Paragraphs>7</Paragraphs>
-  <ScaleCrop>false</ScaleCrop>
-  <HeadingPairs>
-    <vt:vector size="2" baseType="variant">
-      <vt:variant>
-        <vt:lpstr>Title</vt:lpstr>
-      </vt:variant>
-      <vt:variant>
-        <vt:i4>1</vt:i4>
-      </vt:variant>
-    </vt:vector>
-  </HeadingPairs>
-  <TitlesOfParts>
-    <vt:vector size="1" baseType="lpstr">
-      <vt:lpstr/>
-    </vt:vector>
-  </TitlesOfParts>
-  <Company/>
-  <LinksUpToDate>false</LinksUpToDate>
-  <CharactersWithSpaces>3699</CharactersWithSpaces>
-  <SharedDoc>false</SharedDoc>
-  <HyperlinksChanged>false</HyperlinksChanged>
-  <AppVersion>16.0000</AppVersion>
-</Properties>
-</file>
-
-<file path=docProps\core.xml><?xml version="1.0" encoding="utf-8"?>
-<cp:coreProperties xmlns:cp="http://schemas.openxmlformats.org/package/2006/metadata/core-properties" xmlns:dc="http://purl.org/dc/elements/1.1/" xmlns:dcterms="http://purl.org/dc/terms/" xmlns:dcmitype="http://purl.org/dc/dcmitype/" xmlns:xsi="http://www.w3.org/2001/XMLSchema-instance">
-  <dc:creator>Un-named</dc:creator>
-  <cp:lastModifiedBy>lewis Robinson</cp:lastModifiedBy>
-  <cp:revision>9</cp:revision>
-  <dcterms:created xsi:type="dcterms:W3CDTF">2026-09-08T18:29:00Z</dcterms:created>
-  <dcterms:modified xsi:type="dcterms:W3CDTF">2026-09-21T16:40:00Z</dcterms:modified>
-</cp:coreProperties>
-</file>
-
-<file path=word\document.xml><?xml version="1.0" encoding="utf-8"?>
+<file path=word/document.xml><?xml version="1.0" encoding="utf-8"?>
 <w:document xmlns:wpc="http://schemas.microsoft.com/office/word/2010/wordprocessingCanvas" xmlns:cx="http://schemas.microsoft.com/office/drawing/2014/chartex" xmlns:cx1="http://schemas.microsoft.com/office/drawing/2015/9/8/chartex" xmlns:cx2="http://schemas.microsoft.com/office/drawing/2015/10/21/chartex" xmlns:cx3="http://schemas.microsoft.com/office/drawing/2016/5/9/chartex" xmlns:cx4="http://schemas.microsoft.com/office/drawing/2016/5/10/chartex" xmlns:cx5="http://schemas.microsoft.com/office/drawing/2016/5/11/chartex" xmlns:cx6="http://schemas.microsoft.com/office/drawing/2016/5/12/chartex" xmlns:cx7="http://schemas.microsoft.com/office/drawing/2016/5/13/chartex" xmlns:cx8="http://schemas.microsoft.com/office/drawing/2016/5/14/chartex" xmlns:mc="http://schemas.openxmlformats.org/markup-compatibility/2006" xmlns:aink="http://schemas.microsoft.com/office/drawing/2016/ink" xmlns:am3d="http://schemas.microsoft.com/office/drawing/2017/model3d" xmlns:o="urn:schemas-microsoft-com:office:office" xmlns:oel="http://schemas.microsoft.com/office/2019/extlst" xmlns:r="http://schemas.openxmlformats.org/officeDocument/2006/relationships" xmlns:m="http://schemas.openxmlformats.org/officeDocument/2006/math" xmlns:v="urn:schemas-microsoft-com:vml" xmlns:wp14="http://schemas.microsoft.com/office/word/2010/wordprocessingDrawing" xmlns:wp="http://schemas.openxmlformats.org/drawingml/2006/wordprocessingDrawing" xmlns:w10="urn:schemas-microsoft-com:office:word" xmlns:w="http://schemas.openxmlformats.org/wordprocessingml/2006/main" xmlns:w14="http://schemas.microsoft.com/office/word/2010/wordml" xmlns:w15="http://schemas.microsoft.com/office/word/2012/wordml" xmlns:w16cex="http://schemas.microsoft.com/office/word/2018/wordml/cex" xmlns:w16cid="http://schemas.microsoft.com/office/word/2016/wordml/cid" xmlns:w16="http://schemas.microsoft.com/office/word/2018/wordml" xmlns:w16du="http://schemas.microsoft.com/office/word/2023/wordml/word16du" xmlns:w16sdtdh="http://schemas.microsoft.com/office/word/2020/wordml/sdtdatahash" xmlns:w16sdtfl="http://schemas.microsoft.com/office/word/2024/wordml/sdtformatlock" xmlns:w16se="http://schemas.microsoft.com/office/word/2015/wordml/symex" xmlns:wpg="http://schemas.microsoft.com/office/word/2010/wordprocessingGroup" xmlns:wpi="http://schemas.microsoft.com/office/word/2010/wordprocessingInk" xmlns:wne="http://schemas.microsoft.com/office/word/2006/wordml" xmlns:wps="http://schemas.microsoft.com/office/word/2010/wordprocessingShape" mc:Ignorable="w14 w15 w16se w16cid w16 w16cex w16sdtdh w16sdtfl w16du wp14">
   <w:body>
     <w:tbl>
@@ -169,14 +123,18 @@
             </w:tcMar>
           </w:tcPr>
           <w:p>
-            <w:r>
-              <w:rPr>
-                <w:rFonts w:ascii="Calibri" w:eastAsia="Calibri" w:hAnsi="Calibri" w:cs="Calibri"/>
-                <w:sz w:val="18"/>
-                <w:szCs w:val="18"/>
-              </w:rPr>
-              <w:t>lewisrobinson.uk</w:t>
-            </w:r>
+            <w:hyperlink r:id="rId10" w:history="1">
+              <w:r>
+                <w:rPr>
+                  <w:rFonts w:ascii="Calibri" w:eastAsia="Calibri" w:hAnsi="Calibri" w:cs="Calibri"/>
+                  <w:color w:val="1155CC"/>
+                  <w:u w:val="single"/>
+                  <w:sz w:val="18"/>
+                  <w:szCs w:val="18"/>
+                </w:rPr>
+                <w:t>lewisrobinson.uk</w:t>
+              </w:r>
+            </w:hyperlink>
           </w:p>
         </w:tc>
         <w:tc>
@@ -241,8 +199,7 @@
     </w:tbl>
     <w:p>
       <w:pPr>
-        <w:spacing w:before="160" w:after="40"/>
-        <w:jc w:val="both"/>
+        <w:spacing w:before="130" w:after="40"/>
       </w:pPr>
       <w:r>
         <w:rPr>
@@ -258,7 +215,7 @@
         <w:pBdr>
           <w:bottom w:val="single" w:sz="6" w:space="2" w:color="1A1A1A"/>
         </w:pBdr>
-        <w:spacing w:before="150" w:after="70"/>
+        <w:spacing w:before="170" w:after="70"/>
       </w:pPr>
       <w:r>
         <w:rPr>
@@ -354,7 +311,7 @@
     </w:tbl>
     <w:p>
       <w:pPr>
-        <w:spacing w:after="60"/>
+        <w:spacing w:after="46"/>
       </w:pPr>
       <w:r>
         <w:rPr>
@@ -375,7 +332,7 @@
           <w:ilvl w:val="0"/>
           <w:numId w:val="2"/>
         </w:numPr>
-        <w:spacing w:after="40"/>
+        <w:spacing w:after="28"/>
       </w:pPr>
       <w:r>
         <w:rPr>
@@ -393,7 +350,7 @@
           <w:ilvl w:val="0"/>
           <w:numId w:val="2"/>
         </w:numPr>
-        <w:spacing w:after="40"/>
+        <w:spacing w:after="28"/>
       </w:pPr>
       <w:r>
         <w:rPr>
@@ -411,7 +368,7 @@
           <w:ilvl w:val="0"/>
           <w:numId w:val="2"/>
         </w:numPr>
-        <w:spacing w:after="40"/>
+        <w:spacing w:after="28"/>
       </w:pPr>
       <w:r>
         <w:rPr>
@@ -427,7 +384,7 @@
         <w:pBdr>
           <w:bottom w:val="single" w:sz="6" w:space="2" w:color="1A1A1A"/>
         </w:pBdr>
-        <w:spacing w:before="150" w:after="70"/>
+        <w:spacing w:before="170" w:after="70"/>
       </w:pPr>
       <w:r>
         <w:rPr>
@@ -515,7 +472,7 @@
     </w:tbl>
     <w:p>
       <w:pPr>
-        <w:spacing w:after="40"/>
+        <w:spacing w:after="28"/>
       </w:pPr>
       <w:r>
         <w:rPr>
@@ -535,7 +492,7 @@
           <w:ilvl w:val="0"/>
           <w:numId w:val="2"/>
         </w:numPr>
-        <w:spacing w:after="40"/>
+        <w:spacing w:after="28"/>
         <w:rPr>
           <w:rFonts w:ascii="Calibri" w:hAnsi="Calibri" w:cs="Calibri"/>
           <w:sz w:val="19"/>
@@ -558,7 +515,7 @@
           <w:ilvl w:val="0"/>
           <w:numId w:val="2"/>
         </w:numPr>
-        <w:spacing w:after="40"/>
+        <w:spacing w:after="28"/>
       </w:pPr>
       <w:r>
         <w:rPr>
@@ -642,7 +599,7 @@
     </w:tbl>
     <w:p>
       <w:pPr>
-        <w:spacing w:after="100"/>
+        <w:spacing w:after="84"/>
         <w:rPr>
           <w:rFonts w:ascii="Calibri" w:eastAsia="Calibri" w:hAnsi="Calibri" w:cs="Calibri"/>
           <w:i/>
@@ -667,7 +624,7 @@
         <w:pBdr>
           <w:bottom w:val="single" w:sz="6" w:space="2" w:color="1A1A1A"/>
         </w:pBdr>
-        <w:spacing w:before="150" w:after="70"/>
+        <w:spacing w:before="170" w:after="70"/>
       </w:pPr>
       <w:r>
         <w:rPr>
@@ -763,7 +720,7 @@
     </w:tbl>
     <w:p>
       <w:pPr>
-        <w:spacing w:after="60"/>
+        <w:spacing w:after="46"/>
       </w:pPr>
       <w:r>
         <w:rPr>
@@ -776,14 +733,16 @@
         </w:rPr>
         <w:t xml:space="preserve">North-East · </w:t>
       </w:r>
-      <w:r>
-        <w:rPr>
-          <w:rFonts w:ascii="Calibri" w:eastAsia="Calibri" w:hAnsi="Calibri" w:cs="Calibri"/>
-          <w:color w:val="1155CC"/>
-          <w:u w:val="single"/>
-        </w:rPr>
-        <w:t>restrum.uk</w:t>
-      </w:r>
+      <w:hyperlink r:id="rId11" w:history="1">
+        <w:r>
+          <w:rPr>
+            <w:rFonts w:ascii="Calibri" w:eastAsia="Calibri" w:hAnsi="Calibri" w:cs="Calibri"/>
+            <w:color w:val="1155CC"/>
+            <w:u w:val="single"/>
+          </w:rPr>
+          <w:t>restrum.uk</w:t>
+        </w:r>
+      </w:hyperlink>
     </w:p>
     <w:p>
       <w:pPr>
@@ -792,7 +751,7 @@
           <w:ilvl w:val="0"/>
           <w:numId w:val="2"/>
         </w:numPr>
-        <w:spacing w:after="40"/>
+        <w:spacing w:after="28"/>
       </w:pPr>
       <w:r>
         <w:rPr>
@@ -810,7 +769,7 @@
           <w:ilvl w:val="0"/>
           <w:numId w:val="2"/>
         </w:numPr>
-        <w:spacing w:after="40"/>
+        <w:spacing w:after="28"/>
       </w:pPr>
       <w:r>
         <w:rPr>
@@ -828,7 +787,7 @@
           <w:ilvl w:val="0"/>
           <w:numId w:val="2"/>
         </w:numPr>
-        <w:spacing w:after="40"/>
+        <w:spacing w:after="28"/>
       </w:pPr>
       <w:r>
         <w:rPr>
@@ -846,7 +805,7 @@
           <w:ilvl w:val="0"/>
           <w:numId w:val="2"/>
         </w:numPr>
-        <w:spacing w:after="40"/>
+        <w:spacing w:after="28"/>
       </w:pPr>
       <w:r>
         <w:rPr>
@@ -855,155 +814,6 @@
           <w:szCs w:val="19"/>
         </w:rPr>
         <w:t>React 19 / TypeScript frontend; deployed via Docker Compose to a VPS behind Cloudflare, with CI running PHPUnit and Pint.</w:t>
-      </w:r>
-    </w:p>
-    <w:tbl>
-      <w:tblPr>
-        <w:tblW w:w="10666" w:type="dxa"/>
-        <w:tblBorders>
-          <w:top w:val="none" w:sz="0" w:space="0" w:color="FFFFFF"/>
-          <w:left w:val="none" w:sz="0" w:space="0" w:color="FFFFFF"/>
-          <w:bottom w:val="none" w:sz="0" w:space="0" w:color="FFFFFF"/>
-          <w:right w:val="none" w:sz="0" w:space="0" w:color="FFFFFF"/>
-          <w:insideH w:val="none" w:sz="0" w:space="0" w:color="FFFFFF"/>
-          <w:insideV w:val="none" w:sz="0" w:space="0" w:color="FFFFFF"/>
-        </w:tblBorders>
-        <w:tblCellMar>
-          <w:left w:w="10" w:type="dxa"/>
-          <w:right w:w="10" w:type="dxa"/>
-        </w:tblCellMar>
-        <w:tblLook w:val="0000" w:firstRow="0" w:lastRow="0" w:firstColumn="0" w:lastColumn="0" w:noHBand="0" w:noVBand="0"/>
-      </w:tblPr>
-      <w:tblGrid>
-        <w:gridCol w:w="7466"/>
-        <w:gridCol w:w="3200"/>
-      </w:tblGrid>
-      <w:tr>
-        <w:tc>
-          <w:tcPr>
-            <w:tcW w:w="7466" w:type="dxa"/>
-            <w:tcMar>
-              <w:top w:w="0" w:type="dxa"/>
-              <w:left w:w="0" w:type="dxa"/>
-              <w:bottom w:w="0" w:type="dxa"/>
-              <w:right w:w="0" w:type="dxa"/>
-            </w:tcMar>
-          </w:tcPr>
-          <w:p>
-            <w:r>
-              <w:rPr>
-                <w:rFonts w:ascii="Calibri" w:eastAsia="Calibri" w:hAnsi="Calibri" w:cs="Calibri"/>
-                <w:b/>
-                <w:bCs/>
-                <w:sz w:val="21"/>
-                <w:szCs w:val="21"/>
-              </w:rPr>
-              <w:t>Seedle</w:t>
-            </w:r>
-            <w:r>
-              <w:rPr>
-                <w:rFonts w:ascii="Calibri" w:eastAsia="Calibri" w:hAnsi="Calibri" w:cs="Calibri"/>
-                <w:sz w:val="19"/>
-                <w:szCs w:val="19"/>
-              </w:rPr>
-              <w:t xml:space="preserve"> Gardening Swap &amp; Planning Platform (Solo Project)</w:t>
-            </w:r>
-          </w:p>
-        </w:tc>
-        <w:tc>
-          <w:tcPr>
-            <w:tcW w:w="3200" w:type="dxa"/>
-            <w:tcMar>
-              <w:top w:w="0" w:type="dxa"/>
-              <w:left w:w="0" w:type="dxa"/>
-              <w:bottom w:w="0" w:type="dxa"/>
-              <w:right w:w="0" w:type="dxa"/>
-            </w:tcMar>
-          </w:tcPr>
-          <w:p>
-            <w:pPr>
-              <w:jc w:val="right"/>
-            </w:pPr>
-            <w:r>
-              <w:rPr>
-                <w:rFonts w:ascii="Calibri" w:eastAsia="Calibri" w:hAnsi="Calibri" w:cs="Calibri"/>
-                <w:b/>
-                <w:bCs/>
-              </w:rPr>
-              <w:t>Sept 2026</w:t>
-            </w:r>
-          </w:p>
-        </w:tc>
-      </w:tr>
-    </w:tbl>
-    <w:p>
-      <w:pPr>
-        <w:spacing w:after="60"/>
-      </w:pPr>
-      <w:r>
-        <w:rPr>
-          <w:rFonts w:ascii="Calibri" w:eastAsia="Calibri" w:hAnsi="Calibri" w:cs="Calibri"/>
-          <w:i/>
-          <w:iCs/>
-          <w:color w:val="444444"/>
-          <w:sz w:val="19"/>
-          <w:szCs w:val="19"/>
-        </w:rPr>
-        <w:t>North-East · Solo project · github.com/lewisr23/Seedle</w:t>
-      </w:r>
-    </w:p>
-    <w:p>
-      <w:pPr>
-        <w:pStyle w:val="ListParagraph"/>
-        <w:numPr>
-          <w:ilvl w:val="0"/>
-          <w:numId w:val="2"/>
-        </w:numPr>
-        <w:spacing w:after="40"/>
-      </w:pPr>
-      <w:r>
-        <w:rPr>
-          <w:rFonts w:ascii="Calibri" w:eastAsia="Calibri" w:hAnsi="Calibri" w:cs="Calibri"/>
-          <w:sz w:val="19"/>
-          <w:szCs w:val="19"/>
-        </w:rPr>
-        <w:t>Built a Laravel 13 / PHP 8.4 REST API with Sanctum auth and service classes for search, checkout and garden logic.</w:t>
-      </w:r>
-    </w:p>
-    <w:p>
-      <w:pPr>
-        <w:pStyle w:val="ListParagraph"/>
-        <w:numPr>
-          <w:ilvl w:val="0"/>
-          <w:numId w:val="2"/>
-        </w:numPr>
-        <w:spacing w:after="40"/>
-      </w:pPr>
-      <w:r>
-        <w:rPr>
-          <w:rFonts w:ascii="Calibri" w:eastAsia="Calibri" w:hAnsi="Calibri" w:cs="Calibri"/>
-          <w:sz w:val="19"/>
-          <w:szCs w:val="19"/>
-        </w:rPr>
-        <w:t>Added Elasticsearch-backed faceted search with a plain-MySQL fallback, exercised directly by the test suite.</w:t>
-      </w:r>
-    </w:p>
-    <w:p>
-      <w:pPr>
-        <w:pStyle w:val="ListParagraph"/>
-        <w:numPr>
-          <w:ilvl w:val="0"/>
-          <w:numId w:val="2"/>
-        </w:numPr>
-        <w:spacing w:after="40"/>
-      </w:pPr>
-      <w:r>
-        <w:rPr>
-          <w:rFonts w:ascii="Calibri" w:eastAsia="Calibri" w:hAnsi="Calibri" w:cs="Calibri"/>
-          <w:sz w:val="19"/>
-          <w:szCs w:val="19"/>
-        </w:rPr>
-        <w:t>Split checkout into a row-locked DB transaction and an async pipeline of Redis-queued jobs; 129 PHPUnit tests, Docker Compose across 8 services, GitHub Actions CI.</w:t>
       </w:r>
     </w:p>
     <w:tbl>
@@ -1087,7 +897,7 @@
     </w:tbl>
     <w:p>
       <w:pPr>
-        <w:spacing w:after="60"/>
+        <w:spacing w:after="46"/>
       </w:pPr>
       <w:r>
         <w:rPr>
@@ -1118,7 +928,7 @@
           <w:ilvl w:val="0"/>
           <w:numId w:val="2"/>
         </w:numPr>
-        <w:spacing w:after="40"/>
+        <w:spacing w:after="28"/>
       </w:pPr>
       <w:r>
         <w:rPr>
@@ -1127,6 +937,165 @@
           <w:szCs w:val="19"/>
         </w:rPr>
         <w:t xml:space="preserve">Built and shipped a live browser-based glitch art generator (React + Vite) with a hybrid WebGL/Canvas 2D rendering pipeline for real-time image, video, and webcam effects, including client-side video export to over 200 users. </w:t>
+      </w:r>
+    </w:p>
+    <w:tbl>
+      <w:tblPr>
+        <w:tblW w:w="10666" w:type="dxa"/>
+        <w:tblBorders>
+          <w:top w:val="none" w:sz="0" w:space="0" w:color="FFFFFF"/>
+          <w:left w:val="none" w:sz="0" w:space="0" w:color="FFFFFF"/>
+          <w:bottom w:val="none" w:sz="0" w:space="0" w:color="FFFFFF"/>
+          <w:right w:val="none" w:sz="0" w:space="0" w:color="FFFFFF"/>
+          <w:insideH w:val="none" w:sz="0" w:space="0" w:color="FFFFFF"/>
+          <w:insideV w:val="none" w:sz="0" w:space="0" w:color="FFFFFF"/>
+        </w:tblBorders>
+        <w:tblCellMar>
+          <w:left w:w="10" w:type="dxa"/>
+          <w:right w:w="10" w:type="dxa"/>
+        </w:tblCellMar>
+        <w:tblLook w:val="0000" w:firstRow="0" w:lastRow="0" w:firstColumn="0" w:lastColumn="0" w:noHBand="0" w:noVBand="0"/>
+      </w:tblPr>
+      <w:tblGrid>
+        <w:gridCol w:w="7466"/>
+        <w:gridCol w:w="3200"/>
+      </w:tblGrid>
+      <w:tr>
+        <w:tc>
+          <w:tcPr>
+            <w:tcW w:w="7466" w:type="dxa"/>
+            <w:tcMar>
+              <w:top w:w="0" w:type="dxa"/>
+              <w:left w:w="0" w:type="dxa"/>
+              <w:bottom w:w="0" w:type="dxa"/>
+              <w:right w:w="0" w:type="dxa"/>
+            </w:tcMar>
+          </w:tcPr>
+          <w:p>
+            <w:r>
+              <w:rPr>
+                <w:rFonts w:ascii="Calibri" w:eastAsia="Calibri" w:hAnsi="Calibri" w:cs="Calibri"/>
+                <w:b/>
+                <w:bCs/>
+                <w:sz w:val="21"/>
+                <w:szCs w:val="21"/>
+              </w:rPr>
+              <w:t xml:space="preserve">Seedle </w:t>
+            </w:r>
+            <w:r>
+              <w:rPr>
+                <w:rFonts w:ascii="Calibri" w:eastAsia="Calibri" w:hAnsi="Calibri" w:cs="Calibri"/>
+                <w:sz w:val="19"/>
+                <w:szCs w:val="19"/>
+              </w:rPr>
+              <w:t xml:space="preserve">Gardening Swap &amp; Planning Platform (Solo Project)</w:t>
+            </w:r>
+          </w:p>
+        </w:tc>
+        <w:tc>
+          <w:tcPr>
+            <w:tcW w:w="3200" w:type="dxa"/>
+            <w:tcMar>
+              <w:top w:w="0" w:type="dxa"/>
+              <w:left w:w="0" w:type="dxa"/>
+              <w:bottom w:w="0" w:type="dxa"/>
+              <w:right w:w="0" w:type="dxa"/>
+            </w:tcMar>
+          </w:tcPr>
+          <w:p>
+            <w:pPr>
+              <w:jc w:val="right"/>
+            </w:pPr>
+            <w:r>
+              <w:rPr>
+                <w:rFonts w:ascii="Calibri" w:eastAsia="Calibri" w:hAnsi="Calibri" w:cs="Calibri"/>
+                <w:b/>
+                <w:bCs/>
+              </w:rPr>
+              <w:t>Sept 2026</w:t>
+            </w:r>
+          </w:p>
+        </w:tc>
+      </w:tr>
+    </w:tbl>
+    <w:p>
+      <w:pPr>
+        <w:spacing w:after="46"/>
+      </w:pPr>
+      <w:r>
+        <w:rPr>
+          <w:rFonts w:ascii="Calibri" w:eastAsia="Calibri" w:hAnsi="Calibri" w:cs="Calibri"/>
+          <w:i/>
+          <w:iCs/>
+          <w:color w:val="444444"/>
+          <w:sz w:val="19"/>
+          <w:szCs w:val="19"/>
+        </w:rPr>
+        <w:t xml:space="preserve">North-East · Solo project · </w:t>
+      </w:r>
+      <w:hyperlink r:id="rId12" w:history="1">
+        <w:r>
+          <w:rPr>
+            <w:rFonts w:ascii="Calibri" w:eastAsia="Calibri" w:hAnsi="Calibri" w:cs="Calibri"/>
+            <w:color w:val="1155CC"/>
+            <w:u w:val="single"/>
+          </w:rPr>
+          <w:t>github.com/lewisr23/Seedle</w:t>
+        </w:r>
+      </w:hyperlink>
+    </w:p>
+    <w:p>
+      <w:pPr>
+        <w:pStyle w:val="ListParagraph"/>
+        <w:numPr>
+          <w:ilvl w:val="0"/>
+          <w:numId w:val="2"/>
+        </w:numPr>
+        <w:spacing w:after="28"/>
+      </w:pPr>
+      <w:r>
+        <w:rPr>
+          <w:rFonts w:ascii="Calibri" w:eastAsia="Calibri" w:hAnsi="Calibri" w:cs="Calibri"/>
+          <w:sz w:val="19"/>
+          <w:szCs w:val="19"/>
+        </w:rPr>
+        <w:t>Built a Laravel 13 / PHP 8.4 REST API with Sanctum auth and service classes for search, checkout and garden logic.</w:t>
+      </w:r>
+    </w:p>
+    <w:p>
+      <w:pPr>
+        <w:pStyle w:val="ListParagraph"/>
+        <w:numPr>
+          <w:ilvl w:val="0"/>
+          <w:numId w:val="2"/>
+        </w:numPr>
+        <w:spacing w:after="28"/>
+      </w:pPr>
+      <w:r>
+        <w:rPr>
+          <w:rFonts w:ascii="Calibri" w:eastAsia="Calibri" w:hAnsi="Calibri" w:cs="Calibri"/>
+          <w:sz w:val="19"/>
+          <w:szCs w:val="19"/>
+        </w:rPr>
+        <w:t>Added Elasticsearch-backed faceted search with a plain-MySQL fallback, exercised directly by the test suite.</w:t>
+      </w:r>
+    </w:p>
+    <w:p>
+      <w:pPr>
+        <w:pStyle w:val="ListParagraph"/>
+        <w:numPr>
+          <w:ilvl w:val="0"/>
+          <w:numId w:val="2"/>
+        </w:numPr>
+        <w:spacing w:after="28"/>
+      </w:pPr>
+      <w:r>
+        <w:rPr>
+          <w:rFonts w:ascii="Calibri" w:eastAsia="Calibri" w:hAnsi="Calibri" w:cs="Calibri"/>
+          <w:sz w:val="19"/>
+          <w:szCs w:val="19"/>
+        </w:rPr>
+        <w:t>Split checkout into a row-locked DB transaction and an async pipeline of Redis-queued jobs; 129 PHPUnit tests, Docker Compose across 8 services, GitHub Actions CI.</w:t>
       </w:r>
     </w:p>
     <w:p>
@@ -1134,7 +1103,7 @@
         <w:pBdr>
           <w:bottom w:val="single" w:sz="6" w:space="2" w:color="1A1A1A"/>
         </w:pBdr>
-        <w:spacing w:before="150" w:after="70"/>
+        <w:spacing w:before="170" w:after="70"/>
       </w:pPr>
       <w:r>
         <w:rPr>
@@ -1156,7 +1125,7 @@
           <w:ilvl w:val="0"/>
           <w:numId w:val="2"/>
         </w:numPr>
-        <w:spacing w:after="30"/>
+        <w:spacing w:after="22"/>
       </w:pPr>
       <w:r>
         <w:rPr>
@@ -1184,7 +1153,7 @@
           <w:ilvl w:val="0"/>
           <w:numId w:val="2"/>
         </w:numPr>
-        <w:spacing w:after="30"/>
+        <w:spacing w:after="22"/>
       </w:pPr>
       <w:r>
         <w:rPr>
@@ -1212,7 +1181,7 @@
           <w:ilvl w:val="0"/>
           <w:numId w:val="2"/>
         </w:numPr>
-        <w:spacing w:after="30"/>
+        <w:spacing w:after="22"/>
       </w:pPr>
       <w:r>
         <w:rPr>
@@ -1240,7 +1209,7 @@
           <w:ilvl w:val="0"/>
           <w:numId w:val="2"/>
         </w:numPr>
-        <w:spacing w:after="30"/>
+        <w:spacing w:after="22"/>
       </w:pPr>
       <w:r>
         <w:rPr>
@@ -1268,7 +1237,7 @@
           <w:ilvl w:val="0"/>
           <w:numId w:val="2"/>
         </w:numPr>
-        <w:spacing w:after="30"/>
+        <w:spacing w:after="22"/>
       </w:pPr>
       <w:r>
         <w:rPr>
@@ -1296,7 +1265,7 @@
           <w:ilvl w:val="0"/>
           <w:numId w:val="2"/>
         </w:numPr>
-        <w:spacing w:after="30"/>
+        <w:spacing w:after="22"/>
       </w:pPr>
       <w:r>
         <w:rPr>
@@ -1322,7 +1291,7 @@
         <w:pBdr>
           <w:bottom w:val="single" w:sz="6" w:space="2" w:color="1A1A1A"/>
         </w:pBdr>
-        <w:spacing w:before="150" w:after="70"/>
+        <w:spacing w:before="170" w:after="70"/>
       </w:pPr>
       <w:r>
         <w:rPr>
@@ -1344,7 +1313,7 @@
           <w:ilvl w:val="0"/>
           <w:numId w:val="2"/>
         </w:numPr>
-        <w:spacing w:after="30"/>
+        <w:spacing w:after="22"/>
       </w:pPr>
       <w:r>
         <w:rPr>
@@ -1362,7 +1331,7 @@
           <w:ilvl w:val="0"/>
           <w:numId w:val="2"/>
         </w:numPr>
-        <w:spacing w:after="30"/>
+        <w:spacing w:after="22"/>
       </w:pPr>
       <w:r>
         <w:rPr>
@@ -1384,45 +1353,7 @@
 </w:document>
 </file>
 
-<file path=word\fontTable.xml><?xml version="1.0" encoding="utf-8"?>
-<w:fonts xmlns:mc="http://schemas.openxmlformats.org/markup-compatibility/2006" xmlns:r="http://schemas.openxmlformats.org/officeDocument/2006/relationships" xmlns:w="http://schemas.openxmlformats.org/wordprocessingml/2006/main" xmlns:w14="http://schemas.microsoft.com/office/word/2010/wordml" xmlns:w15="http://schemas.microsoft.com/office/word/2012/wordml" xmlns:w16cex="http://schemas.microsoft.com/office/word/2018/wordml/cex" xmlns:w16cid="http://schemas.microsoft.com/office/word/2016/wordml/cid" xmlns:w16="http://schemas.microsoft.com/office/word/2018/wordml" xmlns:w16du="http://schemas.microsoft.com/office/word/2023/wordml/word16du" xmlns:w16sdtdh="http://schemas.microsoft.com/office/word/2020/wordml/sdtdatahash" xmlns:w16sdtfl="http://schemas.microsoft.com/office/word/2024/wordml/sdtformatlock" xmlns:w16se="http://schemas.microsoft.com/office/word/2015/wordml/symex" mc:Ignorable="w14 w15 w16se w16cid w16 w16cex w16sdtdh w16sdtfl w16du">
-  <w:font w:name="Times New Roman">
-    <w:panose1 w:val="02020603050405020304"/>
-    <w:charset w:val="00"/>
-    <w:family w:val="roman"/>
-    <w:pitch w:val="variable"/>
-    <w:sig w:usb0="E0002EFF" w:usb1="C000785B" w:usb2="00000009" w:usb3="00000000" w:csb0="000001FF" w:csb1="00000000"/>
-  </w:font>
-  <w:font w:name="Calibri">
-    <w:panose1 w:val="020F0502020204030204"/>
-    <w:charset w:val="00"/>
-    <w:family w:val="swiss"/>
-    <w:pitch w:val="variable"/>
-    <w:sig w:usb0="E4002EFF" w:usb1="C200247B" w:usb2="00000009" w:usb3="00000000" w:csb0="000001FF" w:csb1="00000000"/>
-  </w:font>
-  <w:font w:name="Cambria">
-    <w:panose1 w:val="02040503050406030204"/>
-    <w:charset w:val="00"/>
-    <w:family w:val="roman"/>
-    <w:pitch w:val="variable"/>
-    <w:sig w:usb0="E00006FF" w:usb1="420024FF" w:usb2="02000000" w:usb3="00000000" w:csb0="0000019F" w:csb1="00000000"/>
-  </w:font>
-  <w:font w:name="Aptos Display">
-    <w:charset w:val="00"/>
-    <w:family w:val="swiss"/>
-    <w:pitch w:val="variable"/>
-    <w:sig w:usb0="20000287" w:usb1="00000003" w:usb2="00000000" w:usb3="00000000" w:csb0="0000019F" w:csb1="00000000"/>
-  </w:font>
-  <w:font w:name="Aptos">
-    <w:charset w:val="00"/>
-    <w:family w:val="swiss"/>
-    <w:pitch w:val="variable"/>
-    <w:sig w:usb0="20000287" w:usb1="00000003" w:usb2="00000000" w:usb3="00000000" w:csb0="0000019F" w:csb1="00000000"/>
-  </w:font>
-</w:fonts>
-</file>
-
-<file path=word\numbering.xml><?xml version="1.0" encoding="utf-8"?>
+<file path=word/numbering.xml><?xml version="1.0" encoding="utf-8"?>
 <w:numbering xmlns:wpc="http://schemas.microsoft.com/office/word/2010/wordprocessingCanvas" xmlns:cx="http://schemas.microsoft.com/office/drawing/2014/chartex" xmlns:cx1="http://schemas.microsoft.com/office/drawing/2015/9/8/chartex" xmlns:cx2="http://schemas.microsoft.com/office/drawing/2015/10/21/chartex" xmlns:cx3="http://schemas.microsoft.com/office/drawing/2016/5/9/chartex" xmlns:cx4="http://schemas.microsoft.com/office/drawing/2016/5/10/chartex" xmlns:cx5="http://schemas.microsoft.com/office/drawing/2016/5/11/chartex" xmlns:cx6="http://schemas.microsoft.com/office/drawing/2016/5/12/chartex" xmlns:cx7="http://schemas.microsoft.com/office/drawing/2016/5/13/chartex" xmlns:cx8="http://schemas.microsoft.com/office/drawing/2016/5/14/chartex" xmlns:mc="http://schemas.openxmlformats.org/markup-compatibility/2006" xmlns:aink="http://schemas.microsoft.com/office/drawing/2016/ink" xmlns:am3d="http://schemas.microsoft.com/office/drawing/2017/model3d" xmlns:o="urn:schemas-microsoft-com:office:office" xmlns:oel="http://schemas.microsoft.com/office/2019/extlst" xmlns:r="http://schemas.openxmlformats.org/officeDocument/2006/relationships" xmlns:m="http://schemas.openxmlformats.org/officeDocument/2006/math" xmlns:v="urn:schemas-microsoft-com:vml" xmlns:wp14="http://schemas.microsoft.com/office/word/2010/wordprocessingDrawing" xmlns:wp="http://schemas.openxmlformats.org/drawingml/2006/wordprocessingDrawing" xmlns:w10="urn:schemas-microsoft-com:office:word" xmlns:w="http://schemas.openxmlformats.org/wordprocessingml/2006/main" xmlns:w14="http://schemas.microsoft.com/office/word/2010/wordml" xmlns:w15="http://schemas.microsoft.com/office/word/2012/wordml" xmlns:w16cex="http://schemas.microsoft.com/office/word/2018/wordml/cex" xmlns:w16cid="http://schemas.microsoft.com/office/word/2016/wordml/cid" xmlns:w16="http://schemas.microsoft.com/office/word/2018/wordml" xmlns:w16du="http://schemas.microsoft.com/office/word/2023/wordml/word16du" xmlns:w16sdtdh="http://schemas.microsoft.com/office/word/2020/wordml/sdtdatahash" xmlns:w16sdtfl="http://schemas.microsoft.com/office/word/2024/wordml/sdtformatlock" xmlns:w16se="http://schemas.microsoft.com/office/word/2015/wordml/symex" xmlns:wpg="http://schemas.microsoft.com/office/word/2010/wordprocessingGroup" xmlns:wpi="http://schemas.microsoft.com/office/word/2010/wordprocessingInk" xmlns:wne="http://schemas.microsoft.com/office/word/2006/wordml" xmlns:wps="http://schemas.microsoft.com/office/word/2010/wordprocessingShape" mc:Ignorable="w14 w15 w16se w16cid w16 w16cex w16sdtdh w16sdtfl w16du wp14">
   <w:abstractNum w:abstractNumId="0" w15:restartNumberingAfterBreak="0">
     <w:nsid w:val="264F667E"/>
@@ -1579,66 +1510,7 @@
 </w:numbering>
 </file>
 
-<file path=word\settings.xml><?xml version="1.0" encoding="utf-8"?>
-<w:settings xmlns:mc="http://schemas.openxmlformats.org/markup-compatibility/2006" xmlns:o="urn:schemas-microsoft-com:office:office" xmlns:r="http://schemas.openxmlformats.org/officeDocument/2006/relationships" xmlns:m="http://schemas.openxmlformats.org/officeDocument/2006/math" xmlns:v="urn:schemas-microsoft-com:vml" xmlns:w10="urn:schemas-microsoft-com:office:word" xmlns:w="http://schemas.openxmlformats.org/wordprocessingml/2006/main" xmlns:w14="http://schemas.microsoft.com/office/word/2010/wordml" xmlns:w15="http://schemas.microsoft.com/office/word/2012/wordml" xmlns:w16cex="http://schemas.microsoft.com/office/word/2018/wordml/cex" xmlns:w16cid="http://schemas.microsoft.com/office/word/2016/wordml/cid" xmlns:w16="http://schemas.microsoft.com/office/word/2018/wordml" xmlns:w16du="http://schemas.microsoft.com/office/word/2023/wordml/word16du" xmlns:w16sdtdh="http://schemas.microsoft.com/office/word/2020/wordml/sdtdatahash" xmlns:w16sdtfl="http://schemas.microsoft.com/office/word/2024/wordml/sdtformatlock" xmlns:w16se="http://schemas.microsoft.com/office/word/2015/wordml/symex" xmlns:sl="http://schemas.openxmlformats.org/schemaLibrary/2006/main" mc:Ignorable="w14 w15 w16se w16cid w16 w16cex w16sdtdh w16sdtfl w16du">
-  <w:zoom w:percent="100"/>
-  <w:displayBackgroundShape/>
-  <w:proofState w:spelling="clean" w:grammar="clean"/>
-  <w:defaultTabStop w:val="720"/>
-  <w:characterSpacingControl w:val="doNotCompress"/>
-  <w:compat>
-    <w:compatSetting w:name="compatibilityMode" w:uri="http://schemas.microsoft.com/office/word" w:val="15"/>
-    <w:compatSetting w:name="overrideTableStyleFontSizeAndJustification" w:uri="http://schemas.microsoft.com/office/word" w:val="1"/>
-    <w:compatSetting w:name="enableOpenTypeFeatures" w:uri="http://schemas.microsoft.com/office/word" w:val="1"/>
-    <w:compatSetting w:name="doNotFlipMirrorIndents" w:uri="http://schemas.microsoft.com/office/word" w:val="1"/>
-    <w:compatSetting w:name="differentiateMultirowTableHeaders" w:uri="http://schemas.microsoft.com/office/word" w:val="1"/>
-    <w:compatSetting w:name="useWord2013TrackBottomHyphenation" w:uri="http://schemas.microsoft.com/office/word" w:val="1"/>
-  </w:compat>
-  <w:rsids>
-    <w:rsidRoot w:val="00E5078D"/>
-    <w:rsid w:val="00084308"/>
-    <w:rsid w:val="00107094"/>
-    <w:rsid w:val="001813F1"/>
-    <w:rsid w:val="002E093F"/>
-    <w:rsid w:val="005C4C44"/>
-    <w:rsid w:val="007369F9"/>
-    <w:rsid w:val="0077218D"/>
-    <w:rsid w:val="00820362"/>
-    <w:rsid w:val="00D924BF"/>
-    <w:rsid w:val="00E5078D"/>
-    <w:rsid w:val="00FA3693"/>
-    <w:rsid w:val="00FB4031"/>
-    <w:rsid w:val="00FF37D4"/>
-  </w:rsids>
-  <m:mathPr>
-    <m:mathFont m:val="Cambria Math"/>
-    <m:brkBin m:val="before"/>
-    <m:brkBinSub m:val="--"/>
-    <m:smallFrac m:val="0"/>
-    <m:dispDef/>
-    <m:lMargin m:val="0"/>
-    <m:rMargin m:val="0"/>
-    <m:defJc m:val="centerGroup"/>
-    <m:wrapIndent m:val="1440"/>
-    <m:intLim m:val="subSup"/>
-    <m:naryLim m:val="undOvr"/>
-  </m:mathPr>
-  <w:themeFontLang w:val="en-GB"/>
-  <w:clrSchemeMapping w:bg1="light1" w:t1="dark1" w:bg2="light2" w:t2="dark2" w:accent1="accent1" w:accent2="accent2" w:accent3="accent3" w:accent4="accent4" w:accent5="accent5" w:accent6="accent6" w:hyperlink="hyperlink" w:followedHyperlink="followedHyperlink"/>
-  <w:shapeDefaults>
-    <o:shapedefaults v:ext="edit" spidmax="1026"/>
-    <o:shapelayout v:ext="edit">
-      <o:idmap v:ext="edit" data="1"/>
-    </o:shapelayout>
-  </w:shapeDefaults>
-  <w:decimalSymbol w:val="."/>
-  <w:listSeparator w:val=","/>
-  <w14:docId w14:val="562592AB"/>
-  <w15:docId w15:val="{C6A609E7-4FE7-431B-88AD-E63097161F41}"/>
-</w:settings>
-</file>
-
-<file path=word\styles.xml><?xml version="1.0" encoding="utf-8"?>
+<file path=word/styles.xml><?xml version="1.0" encoding="utf-8"?>
 <w:styles xmlns:mc="http://schemas.openxmlformats.org/markup-compatibility/2006" xmlns:r="http://schemas.openxmlformats.org/officeDocument/2006/relationships" xmlns:w="http://schemas.openxmlformats.org/wordprocessingml/2006/main" xmlns:w14="http://schemas.microsoft.com/office/word/2010/wordml" xmlns:w15="http://schemas.microsoft.com/office/word/2012/wordml" xmlns:w16cex="http://schemas.microsoft.com/office/word/2018/wordml/cex" xmlns:w16cid="http://schemas.microsoft.com/office/word/2016/wordml/cid" xmlns:w16="http://schemas.microsoft.com/office/word/2018/wordml" xmlns:w16du="http://schemas.microsoft.com/office/word/2023/wordml/word16du" xmlns:w16sdtdh="http://schemas.microsoft.com/office/word/2020/wordml/sdtdatahash" xmlns:w16sdtfl="http://schemas.microsoft.com/office/word/2024/wordml/sdtformatlock" xmlns:w16se="http://schemas.microsoft.com/office/word/2015/wordml/symex" mc:Ignorable="w14 w15 w16se w16cid w16 w16cex w16sdtdh w16sdtfl w16du">
   <w:docDefaults>
     <w:rPrDefault>
@@ -2229,7 +2101,7 @@
 </w:styles>
 </file>
 
-<file path=word\theme\theme1.xml><?xml version="1.0" encoding="utf-8"?>
+<file path=word/theme/theme1.xml><?xml version="1.0" encoding="utf-8"?>
 <a:theme xmlns:a="http://schemas.openxmlformats.org/drawingml/2006/main" name="Office Theme">
   <a:themeElements>
     <a:clrScheme name="Office">
@@ -2542,11 +2414,4 @@
     </a:ext>
   </a:extLst>
 </a:theme>
-</file>
-
-<file path=word\webSettings.xml><?xml version="1.0" encoding="utf-8"?>
-<w:webSettings xmlns:mc="http://schemas.openxmlformats.org/markup-compatibility/2006" xmlns:r="http://schemas.openxmlformats.org/officeDocument/2006/relationships" xmlns:w="http://schemas.openxmlformats.org/wordprocessingml/2006/main" xmlns:w14="http://schemas.microsoft.com/office/word/2010/wordml" xmlns:w15="http://schemas.microsoft.com/office/word/2012/wordml" xmlns:w16cex="http://schemas.microsoft.com/office/word/2018/wordml/cex" xmlns:w16cid="http://schemas.microsoft.com/office/word/2016/wordml/cid" xmlns:w16="http://schemas.microsoft.com/office/word/2018/wordml" xmlns:w16du="http://schemas.microsoft.com/office/word/2023/wordml/word16du" xmlns:w16sdtdh="http://schemas.microsoft.com/office/word/2020/wordml/sdtdatahash" xmlns:w16sdtfl="http://schemas.microsoft.com/office/word/2024/wordml/sdtformatlock" xmlns:w16se="http://schemas.microsoft.com/office/word/2015/wordml/symex" mc:Ignorable="w14 w15 w16se w16cid w16 w16cex w16sdtdh w16sdtfl w16du">
-  <w:relyOnVML/>
-  <w:allowPNG/>
-</w:webSettings>
 </file>
</xml_diff>

<commit_message>
Correct BA dates to Sept 2022 to Aug 2025
</commit_message>
<xml_diff>
--- a/src/assets/Lewis_Robinson_CV_web.docx
+++ b/src/assets/Lewis_Robinson_CV_web.docx
@@ -123,14 +123,14 @@
             </w:tcMar>
           </w:tcPr>
           <w:p>
-            <w:hyperlink r:id="rId10" w:history="1">
+            <w:hyperlink r:id="rId6" w:history="1">
               <w:r>
                 <w:rPr>
                   <w:rFonts w:ascii="Calibri" w:eastAsia="Calibri" w:hAnsi="Calibri" w:cs="Calibri"/>
                   <w:color w:val="1155CC"/>
-                  <w:u w:val="single"/>
                   <w:sz w:val="18"/>
                   <w:szCs w:val="18"/>
+                  <w:u w:val="single"/>
                 </w:rPr>
                 <w:t>lewisrobinson.uk</w:t>
               </w:r>
@@ -183,7 +183,7 @@
               </w:rPr>
               <w:t xml:space="preserve">LinkedIn: </w:t>
             </w:r>
-            <w:hyperlink r:id="rId6" w:history="1">
+            <w:hyperlink r:id="rId7" w:history="1">
               <w:r>
                 <w:rPr>
                   <w:rFonts w:ascii="Calibri" w:eastAsia="Calibri" w:hAnsi="Calibri" w:cs="Calibri"/>
@@ -591,7 +591,23 @@
                 <w:b/>
                 <w:bCs/>
               </w:rPr>
-              <w:t>Sept 2021 – Aug 2024</w:t>
+              <w:t>Sept 2022</w:t>
+            </w:r>
+            <w:r>
+              <w:rPr>
+                <w:rFonts w:ascii="Calibri" w:eastAsia="Calibri" w:hAnsi="Calibri" w:cs="Calibri"/>
+                <w:b/>
+                <w:bCs/>
+              </w:rPr>
+              <w:t xml:space="preserve"> – </w:t>
+            </w:r>
+            <w:r>
+              <w:rPr>
+                <w:rFonts w:ascii="Calibri" w:eastAsia="Calibri" w:hAnsi="Calibri" w:cs="Calibri"/>
+                <w:b/>
+                <w:bCs/>
+              </w:rPr>
+              <w:t>Aug 2025</w:t>
             </w:r>
           </w:p>
         </w:tc>
@@ -733,7 +749,7 @@
         </w:rPr>
         <w:t xml:space="preserve">North-East · </w:t>
       </w:r>
-      <w:hyperlink r:id="rId11" w:history="1">
+      <w:hyperlink r:id="rId8" w:history="1">
         <w:r>
           <w:rPr>
             <w:rFonts w:ascii="Calibri" w:eastAsia="Calibri" w:hAnsi="Calibri" w:cs="Calibri"/>
@@ -910,7 +926,7 @@
         </w:rPr>
         <w:t xml:space="preserve">North-East · </w:t>
       </w:r>
-      <w:hyperlink r:id="rId7" w:history="1">
+      <w:hyperlink r:id="rId9" w:history="1">
         <w:r>
           <w:rPr>
             <w:rFonts w:ascii="Calibri" w:eastAsia="Calibri" w:hAnsi="Calibri" w:cs="Calibri"/>
@@ -988,7 +1004,7 @@
                 <w:sz w:val="19"/>
                 <w:szCs w:val="19"/>
               </w:rPr>
-              <w:t xml:space="preserve">Gardening Swap &amp; Planning Platform (Solo Project)</w:t>
+              <w:t>Gardening Swap &amp; Planning Platform (Solo Project)</w:t>
             </w:r>
           </w:p>
         </w:tc>
@@ -1033,7 +1049,7 @@
         </w:rPr>
         <w:t xml:space="preserve">North-East · Solo project · </w:t>
       </w:r>
-      <w:hyperlink r:id="rId12" w:history="1">
+      <w:hyperlink r:id="rId10" w:history="1">
         <w:r>
           <w:rPr>
             <w:rFonts w:ascii="Calibri" w:eastAsia="Calibri" w:hAnsi="Calibri" w:cs="Calibri"/>
@@ -1339,7 +1355,6 @@
           <w:sz w:val="19"/>
           <w:szCs w:val="19"/>
         </w:rPr>
-        <w:lastRenderedPageBreak/>
         <w:t>CS50P: Introduction to Programming with Python, Harvard University (edX)</w:t>
       </w:r>
     </w:p>

</xml_diff>